<commit_message>
Refactor code and documentation for clean, readable style
</commit_message>
<xml_diff>
--- a/Email_Deliverability_Checker_Submission.docx
+++ b/Email_Deliverability_Checker_Submission.docx
@@ -24,9 +24,9 @@
         <w:rPr>
           <w:rFonts w:ascii="Arial" w:hAnsi="Arial"/>
           <w:color w:val="64748B"/>
-          <w:sz w:val="26"/>
+          <w:sz w:val="24"/>
         </w:rPr>
-        <w:t>Software Development Course Assignment Submission Document</w:t>
+        <w:t>Software Development Course Project - Assignment Submission Document</w:t>
       </w:r>
     </w:p>
     <w:tbl>
@@ -74,7 +74,7 @@
                 <w:color w:val="0F172A"/>
                 <w:sz w:val="19"/>
               </w:rPr>
-              <w:t>Email Deliverability Checker (Safe Envelope Inspector)</w:t>
+              <w:t>Email Deliverability Checker</w:t>
             </w:r>
           </w:p>
         </w:tc>
@@ -95,7 +95,7 @@
                 <w:color w:val="0F172A"/>
                 <w:sz w:val="19"/>
               </w:rPr>
-              <w:t>Author / Student:</w:t>
+              <w:t>Course / Assignment:</w:t>
             </w:r>
           </w:p>
         </w:tc>
@@ -113,7 +113,7 @@
                 <w:color w:val="0F172A"/>
                 <w:sz w:val="19"/>
               </w:rPr>
-              <w:t>Student Submission</w:t>
+              <w:t>Software Development Course Project</w:t>
             </w:r>
           </w:p>
         </w:tc>
@@ -214,7 +214,7 @@
                 <w:color w:val="0F172A"/>
                 <w:sz w:val="19"/>
               </w:rPr>
-              <w:t>Core Stack:</w:t>
+              <w:t>Tech Stack:</w:t>
             </w:r>
           </w:p>
         </w:tc>
@@ -260,10 +260,10 @@
         <w:spacing w:after="240"/>
       </w:pPr>
       <w:r>
-        <w:t>The Email Deliverability Checker is an end-to-end web application that allows users to submit batches of up to 100 email addresses and evaluate their bounce risk. Rather than claiming 100% guaranteed mailbox verification, the system uses conservative, transparent heuristics categorized into three explainable outcomes: 'Likely deliverable', 'Likely to bounce', and 'Unknown'.</w:t>
+        <w:t>I built this Email Deliverability Checker to help users check whether an email list is safe to send to without actually sending test emails or using paid third-party APIs. Users can paste up to 100 emails at a time. The application cleans duplicate entries, checks the email syntax, resolves domain MX records through DNS, and attempts a safe SMTP handshake.</w:t>
         <w:br/>
         <w:br/>
-        <w:t>Crucially, the application adheres to strict anti-spam guidelines: it never sends actual email messages, never issues the SMTP DATA command, and stores zero user emails in databases or persistent logs.</w:t>
+        <w:t>To avoid misleading users, the app categorizes results into three realistic statuses: 'Likely deliverable', 'Likely to bounce', and 'Unknown'. All processing happens in memory without storing email addresses in a database.</w:t>
       </w:r>
     </w:p>
     <w:p>
@@ -275,7 +275,7 @@
           <w:b/>
           <w:color w:val="4F46E5"/>
         </w:rPr>
-        <w:t>2. Key Application Features</w:t>
+        <w:t>2. Main Features</w:t>
       </w:r>
     </w:p>
     <w:p>
@@ -287,10 +287,10 @@
         <w:rPr>
           <w:b/>
         </w:rPr>
-        <w:t xml:space="preserve">Multi-Stage Pipeline: </w:t>
+        <w:t xml:space="preserve">Multi-step checking logic: </w:t>
       </w:r>
       <w:r>
-        <w:t>Performs format syntax validation (RFC 5322), authoritative DNS MX record lookup (dnspython), fallback A-record resolution (RFC 5321), and optional non-intrusive SMTP handshake probes.</w:t>
+        <w:t>Combines regex format validation, dnspython for MX and fallback A record lookups, and optional socket/SMTP recipient probes.</w:t>
       </w:r>
     </w:p>
     <w:p>
@@ -302,10 +302,10 @@
         <w:rPr>
           <w:b/>
         </w:rPr>
-        <w:t xml:space="preserve">Modern, Accessible UI: </w:t>
+        <w:t xml:space="preserve">No actual emails sent: </w:t>
       </w:r>
       <w:r>
-        <w:t>Clean white/indigo design system with live address counter, responsive tables, KPI summary cards, filter pills (All, Deliverable, Bounce, Unknown), and instant text search.</w:t>
+        <w:t>Only performs the recipient check up to the RCPT TO command and closes the connection with QUIT. Never sends DATA or message bodies.</w:t>
       </w:r>
     </w:p>
     <w:p>
@@ -317,10 +317,10 @@
         <w:rPr>
           <w:b/>
         </w:rPr>
-        <w:t xml:space="preserve">CSV Export Functionality: </w:t>
+        <w:t xml:space="preserve">Batch processing &amp; deduplication: </w:t>
       </w:r>
       <w:r>
-        <w:t>Enables instant one-click export of verified results into timestamped CSV reports.</w:t>
+        <w:t>Automatically strips whitespace and duplicate addresses, with a safety cap of 100 unique emails per request.</w:t>
       </w:r>
     </w:p>
     <w:p>
@@ -332,10 +332,10 @@
         <w:rPr>
           <w:b/>
         </w:rPr>
-        <w:t xml:space="preserve">Strict Limits &amp; Concurrency: </w:t>
+        <w:t xml:space="preserve">Clean, responsive UI: </w:t>
       </w:r>
       <w:r>
-        <w:t>Enforces a strict 100 unique email batch limit, automatic deduplication, and bounded multithreaded evaluation (ThreadPoolExecutor).</w:t>
+        <w:t>Built with vanilla JavaScript, modern CSS, dynamic status badges, summary count cards, search filtering, and live counter.</w:t>
       </w:r>
     </w:p>
     <w:p>
@@ -347,10 +347,10 @@
         <w:rPr>
           <w:b/>
         </w:rPr>
-        <w:t xml:space="preserve">Honest Uncertainty Management: </w:t>
+        <w:t xml:space="preserve">CSV download: </w:t>
       </w:r>
       <w:r>
-        <w:t>Explicitly categorizes ambiguous responses, greylisting, and firewall-blocked environments as 'Unknown' rather than presenting false positive deliverables or bounces.</w:t>
+        <w:t>Includes a download button to export the checked results and reasons into a CSV file.</w:t>
       </w:r>
     </w:p>
     <w:p>
@@ -367,7 +367,7 @@
           <w:b/>
           <w:color w:val="4F46E5"/>
         </w:rPr>
-        <w:t>3. Deliverability Classifications</w:t>
+        <w:t>3. Deliverability Statuses</w:t>
       </w:r>
     </w:p>
     <w:tbl>
@@ -394,13 +394,13 @@
                 <w:color w:val="FFFFFF"/>
                 <w:sz w:val="19"/>
               </w:rPr>
-              <w:t>Category</w:t>
+              <w:t>Status</w:t>
             </w:r>
           </w:p>
         </w:tc>
         <w:tc>
           <w:tcPr>
-            <w:tcW w:type="dxa" w:w="3168"/>
+            <w:tcW w:type="dxa" w:w="3312"/>
             <w:shd w:fill="4F46E5"/>
           </w:tcPr>
           <w:p>
@@ -410,13 +410,13 @@
                 <w:color w:val="FFFFFF"/>
                 <w:sz w:val="19"/>
               </w:rPr>
-              <w:t>Technical Criteria</w:t>
+              <w:t>Technical Check</w:t>
             </w:r>
           </w:p>
         </w:tc>
         <w:tc>
           <w:tcPr>
-            <w:tcW w:type="dxa" w:w="3600"/>
+            <w:tcW w:type="dxa" w:w="3456"/>
             <w:shd w:fill="4F46E5"/>
           </w:tcPr>
           <w:p>
@@ -426,7 +426,7 @@
                 <w:color w:val="FFFFFF"/>
                 <w:sz w:val="19"/>
               </w:rPr>
-              <w:t>Practical Meaning</w:t>
+              <w:t>Meaning</w:t>
             </w:r>
           </w:p>
         </w:tc>
@@ -452,7 +452,7 @@
         </w:tc>
         <w:tc>
           <w:tcPr>
-            <w:tcW w:type="dxa" w:w="3168"/>
+            <w:tcW w:type="dxa" w:w="3312"/>
             <w:shd w:fill="F8FAFC"/>
           </w:tcPr>
           <w:p>
@@ -463,13 +463,13 @@
               <w:rPr>
                 <w:sz w:val="18"/>
               </w:rPr>
-              <w:t>Valid syntax, active MX records, and mail server returned 250/251 during RCPT TO probe.</w:t>
+              <w:t>Valid syntax, working MX records, and mail server returned 250 OK on recipient check.</w:t>
             </w:r>
           </w:p>
         </w:tc>
         <w:tc>
           <w:tcPr>
-            <w:tcW w:type="dxa" w:w="3600"/>
+            <w:tcW w:type="dxa" w:w="3456"/>
             <w:shd w:fill="F8FAFC"/>
           </w:tcPr>
           <w:p>
@@ -480,7 +480,7 @@
               <w:rPr>
                 <w:sz w:val="18"/>
               </w:rPr>
-              <w:t>High probability of acceptance, though final inbox placement depends on spam filters.</w:t>
+              <w:t>The email is likely active, though spam filters or mailbox quotas can still cause issues.</w:t>
             </w:r>
           </w:p>
         </w:tc>
@@ -506,7 +506,7 @@
         </w:tc>
         <w:tc>
           <w:tcPr>
-            <w:tcW w:type="dxa" w:w="3168"/>
+            <w:tcW w:type="dxa" w:w="3312"/>
             <w:shd w:fill="FFFFFF"/>
           </w:tcPr>
           <w:p>
@@ -517,13 +517,13 @@
               <w:rPr>
                 <w:sz w:val="18"/>
               </w:rPr>
-              <w:t>Malformed syntax, NXDOMAIN (dead domain), missing MX/A records, or server 550 rejection.</w:t>
+              <w:t>Malformed syntax, nonexistent domain (NXDOMAIN), missing MX/A records, or 550 rejection.</w:t>
             </w:r>
           </w:p>
         </w:tc>
         <w:tc>
           <w:tcPr>
-            <w:tcW w:type="dxa" w:w="3600"/>
+            <w:tcW w:type="dxa" w:w="3456"/>
             <w:shd w:fill="FFFFFF"/>
           </w:tcPr>
           <w:p>
@@ -534,7 +534,7 @@
               <w:rPr>
                 <w:sz w:val="18"/>
               </w:rPr>
-              <w:t>Address is defective or mailbox does not exist. High risk of hard bounce.</w:t>
+              <w:t>Address is broken or rejected by the server. Sending to this will almost certainly bounce.</w:t>
             </w:r>
           </w:p>
         </w:tc>
@@ -560,7 +560,7 @@
         </w:tc>
         <w:tc>
           <w:tcPr>
-            <w:tcW w:type="dxa" w:w="3168"/>
+            <w:tcW w:type="dxa" w:w="3312"/>
             <w:shd w:fill="F8FAFC"/>
           </w:tcPr>
           <w:p>
@@ -571,13 +571,13 @@
               <w:rPr>
                 <w:sz w:val="18"/>
               </w:rPr>
-              <w:t>Valid MX exists, but server hides status, greylisting (4xx), port 25 blocked, or timeout.</w:t>
+              <w:t>Domain has mail servers, but server timed out, greylisted the probe, or port 25 is blocked.</w:t>
             </w:r>
           </w:p>
         </w:tc>
         <w:tc>
           <w:tcPr>
-            <w:tcW w:type="dxa" w:w="3600"/>
+            <w:tcW w:type="dxa" w:w="3456"/>
             <w:shd w:fill="F8FAFC"/>
           </w:tcPr>
           <w:p>
@@ -588,7 +588,7 @@
               <w:rPr>
                 <w:sz w:val="18"/>
               </w:rPr>
-              <w:t>Mailbox existence cannot be proven without sending. Conservative classification.</w:t>
+              <w:t>Mailbox status cannot be confirmed without sending a message.</w:t>
             </w:r>
           </w:p>
         </w:tc>
@@ -608,7 +608,7 @@
           <w:b/>
           <w:color w:val="4F46E5"/>
         </w:rPr>
-        <w:t>4. Limitations &amp; Real-World Realities</w:t>
+        <w:t>4. Limitations and Real-World Considerations</w:t>
       </w:r>
     </w:p>
     <w:p>
@@ -616,14 +616,11 @@
         <w:spacing w:after="240"/>
       </w:pPr>
       <w:r>
-        <w:t>Mailbox verification in modern Internet infrastructure is constrained by several security mechanisms:</w:t>
+        <w:t>1. Catch-All domains: Many corporate servers accept all incoming addresses initially (status 250 OK) and only drop invalid mailboxes afterwards, making it impossible to guarantee delivery from the handshake alone.</w:t>
         <w:br/>
+        <w:t>2. Concealed status: Large providers like Microsoft, Yahoo, and iCloud hide recipient status to prevent spammers from harvesting active addresses.</w:t>
         <w:br/>
-        <w:t>1. Catch-All Domains: Many enterprise mail systems accept all incoming addresses indiscriminately at the border and discard nonexistent mailboxes internally to prevent user enumeration attacks.</w:t>
-        <w:br/>
-        <w:t>2. Provider Concealment: Major providers (e.g. Yahoo, Microsoft, iCloud) deliberately obscure mailbox existence from unauthorized third-party IPs.</w:t>
-        <w:br/>
-        <w:t>3. Cloud Provider Port 25 Blocking: Free cloud tiers (such as Render, AWS EC2, and Heroku) strictly block outbound TCP port 25 to curb spam botnets. When deployed in these environments, the application degrades gracefully by verifying DNS MX records and marking addresses as 'Unknown' with an informative explanation.</w:t>
+        <w:t>3. Free cloud hosting limitations: Free hosting providers like Render block outbound port 25. When hosted on Render, the app verifies syntax and DNS MX records, and marks valid domains as 'Unknown' with an explanation rather than throwing false errors.</w:t>
       </w:r>
     </w:p>
     <w:p>
@@ -635,7 +632,7 @@
           <w:b/>
           <w:color w:val="4F46E5"/>
         </w:rPr>
-        <w:t>5. Automated Test Suite Results</w:t>
+        <w:t>5. Automated Testing</w:t>
       </w:r>
     </w:p>
     <w:p>
@@ -643,21 +640,24 @@
         <w:spacing w:after="240"/>
       </w:pPr>
       <w:r>
-        <w:t>The project includes an automated test suite executed with pytest (22 passing unit and integration tests):</w:t>
+        <w:t>I wrote a comprehensive test suite using pytest containing 22 tests covering:</w:t>
         <w:br/>
-        <w:t>• Valid and malformed email syntax edge cases</w:t>
+        <w:t>• Valid and invalid syntax formatting</w:t>
         <w:br/>
-        <w:t>• Input deduplication and 100-address batch size enforcement</w:t>
+        <w:t>• Batch deduplication and the 100 email limit</w:t>
         <w:br/>
-        <w:t>• Mocked DNS MX lookups, NXDOMAIN, NoAnswer, and timeout scenarios</w:t>
+        <w:t>• Mocked DNS MX and fallback A record lookups, NXDOMAIN, and timeouts</w:t>
         <w:br/>
-        <w:t>• Mocked SMTP handshakes (250 OK, 550 User Unknown, 451 Greylisting, connection timeouts)</w:t>
+        <w:t>• Mocked SMTP response codes (250 deliverable, 550 bounce, 451 greylisting, timeouts)</w:t>
         <w:br/>
-        <w:t>• Verification that the SMTP DATA command is NEVER executed under any condition</w:t>
+        <w:t>• Verification that the SMTP DATA command is never called</w:t>
         <w:br/>
-        <w:t>• Full Flask REST API endpoints (/api/check, /api/export-csv, /health)</w:t>
+        <w:t>• Flask routes (/api/check, /api/export-csv, /health)</w:t>
         <w:br/>
-        <w:t>• CSV report integrity and header schema validation</w:t>
+        <w:t>• CSV report format and content</w:t>
+        <w:br/>
+        <w:br/>
+        <w:t>All 22 tests pass locally.</w:t>
       </w:r>
     </w:p>
     <w:sectPr>

</xml_diff>